<commit_message>
Release v1.5.0: add shiftdays date-shifting parameter
Shifts every DA/DT date field by a fixed number of days, preserving
intervals between exams without exposing real calendar dates.
PatientBirthDate is always excluded -- dob: remains the dedicated
parameter for that field, so the two compose with no ordering
dependency. Wired through profiles, per-modality overrides, and
profiles add, matching the existing dob/uid/fixvr plumbing.
</commit_message>
<xml_diff>
--- a/dicomtool-manual.docx
+++ b/dicomtool-manual.docx
@@ -71,7 +71,7 @@
           <w:sz w:val="32"/>
           <w:szCs w:val="32"/>
         </w:rPr>
-        <w:t xml:space="preserve">Usage Manual  v1.4.4</w:t>
+        <w:t xml:space="preserve">Usage Manual  v1.5.0</w:t>
       </w:r>
     </w:p>
     <w:p>
@@ -85,7 +85,7 @@
           <w:sz w:val="24"/>
           <w:szCs w:val="24"/>
         </w:rPr>
-        <w:t xml:space="preserve">July 16, 2026</w:t>
+        <w:t xml:space="preserve">July 28, 2026</w:t>
       </w:r>
     </w:p>
     <w:p>
@@ -1247,6 +1247,14 @@
         <w:pStyle w:val="Code"/>
       </w:pPr>
       <w:r>
+        <w:t xml:space="preserve">    [shiftdays:&lt;n&gt;]</w:t>
+      </w:r>
+    </w:p>
+    <w:p>
+      <w:pPr>
+        <w:pStyle w:val="Code"/>
+      </w:pPr>
+      <w:r>
         <w:t xml:space="preserve">    [uid:&lt;suffix&gt;]</w:t>
       </w:r>
     </w:p>
@@ -1610,6 +1618,83 @@
                 <w:szCs w:val="18"/>
                 <w:shd w:val="clear" w:color="auto" w:fill="EBEBEB"/>
               </w:rPr>
+              <w:t xml:space="preserve">shiftdays:&lt;n&gt;</w:t>
+            </w:r>
+          </w:p>
+        </w:tc>
+        <w:tc>
+          <w:tcPr>
+            <w:tcW w:w="6300" w:type="dxa"/>
+            <w:shd w:val="clear" w:color="auto" w:fill="F5F5F5"/>
+          </w:tcPr>
+          <w:p>
+            <w:r>
+              <w:t xml:space="preserve">Shift every DA (Date) and DT (DateTime) field in each file by </w:t>
+            </w:r>
+            <w:r>
+              <w:rPr>
+                <w:rFonts w:ascii="Courier New" w:hAnsi="Courier New"/>
+                <w:sz w:val="18"/>
+                <w:szCs w:val="18"/>
+                <w:shd w:val="clear" w:color="auto" w:fill="EBEBEB"/>
+              </w:rPr>
+              <w:t xml:space="preserve">n</w:t>
+            </w:r>
+            <w:r>
+              <w:t xml:space="preserve"> days. </w:t>
+            </w:r>
+            <w:r>
+              <w:rPr>
+                <w:rFonts w:ascii="Courier New" w:hAnsi="Courier New"/>
+                <w:sz w:val="18"/>
+                <w:szCs w:val="18"/>
+                <w:shd w:val="clear" w:color="auto" w:fill="EBEBEB"/>
+              </w:rPr>
+              <w:t xml:space="preserve">n</w:t>
+            </w:r>
+            <w:r>
+              <w:t xml:space="preserve"> may be negative, zero, or positive. For DT fields, only the leading date component moves; the time, fraction, and timezone portion is preserved unchanged. Patient Date of Birth (0010,0030) is never affected by </w:t>
+            </w:r>
+            <w:r>
+              <w:rPr>
+                <w:rFonts w:ascii="Courier New" w:hAnsi="Courier New"/>
+                <w:sz w:val="18"/>
+                <w:szCs w:val="18"/>
+                <w:shd w:val="clear" w:color="auto" w:fill="EBEBEB"/>
+              </w:rPr>
+              <w:t xml:space="preserve">shiftdays:</w:t>
+            </w:r>
+            <w:r>
+              <w:t xml:space="preserve"> — use </w:t>
+            </w:r>
+            <w:r>
+              <w:rPr>
+                <w:rFonts w:ascii="Courier New" w:hAnsi="Courier New"/>
+                <w:sz w:val="18"/>
+                <w:szCs w:val="18"/>
+                <w:shd w:val="clear" w:color="auto" w:fill="EBEBEB"/>
+              </w:rPr>
+              <w:t xml:space="preserve">dob:</w:t>
+            </w:r>
+            <w:r>
+              <w:t xml:space="preserve"> for that field instead.</w:t>
+            </w:r>
+          </w:p>
+        </w:tc>
+      </w:tr>
+      <w:tr>
+        <w:tc>
+          <w:tcPr>
+            <w:tcW w:w="2700" w:type="dxa"/>
+          </w:tcPr>
+          <w:p>
+            <w:r>
+              <w:rPr>
+                <w:rFonts w:ascii="Courier New" w:hAnsi="Courier New"/>
+                <w:sz w:val="18"/>
+                <w:szCs w:val="18"/>
+                <w:shd w:val="clear" w:color="auto" w:fill="EBEBEB"/>
+              </w:rPr>
               <w:t xml:space="preserve">uid:&lt;suffix&gt;</w:t>
             </w:r>
           </w:p>
@@ -1617,37 +1702,58 @@
         <w:tc>
           <w:tcPr>
             <w:tcW w:w="6300" w:type="dxa"/>
+          </w:tcPr>
+          <w:p>
+            <w:r>
+              <w:t xml:space="preserve">Append </w:t>
+            </w:r>
+            <w:r>
+              <w:rPr>
+                <w:rFonts w:ascii="Courier New" w:hAnsi="Courier New"/>
+                <w:sz w:val="18"/>
+                <w:szCs w:val="18"/>
+                <w:shd w:val="clear" w:color="auto" w:fill="EBEBEB"/>
+              </w:rPr>
+              <w:t xml:space="preserve">.&lt;suffix&gt;</w:t>
+            </w:r>
+            <w:r>
+              <w:t xml:space="preserve"> to every UID field in each file. If the result would exceed 64 characters the last dot-delimited component is replaced instead of appended. </w:t>
+            </w:r>
+            <w:r>
+              <w:rPr>
+                <w:rFonts w:ascii="Courier New" w:hAnsi="Courier New"/>
+                <w:sz w:val="18"/>
+                <w:szCs w:val="18"/>
+                <w:shd w:val="clear" w:color="auto" w:fill="EBEBEB"/>
+              </w:rPr>
+              <w:t xml:space="preserve">&lt;suffix&gt;</w:t>
+            </w:r>
+            <w:r>
+              <w:t xml:space="preserve"> must contain digits only. Transfer Syntax UIDs are excluded. Mutually exclusive with </w:t>
+            </w:r>
+            <w:r>
+              <w:rPr>
+                <w:rFonts w:ascii="Courier New" w:hAnsi="Courier New"/>
+                <w:sz w:val="18"/>
+                <w:szCs w:val="18"/>
+                <w:shd w:val="clear" w:color="auto" w:fill="EBEBEB"/>
+              </w:rPr>
+              <w:t xml:space="preserve">remapuids:true</w:t>
+            </w:r>
+            <w:r>
+              <w:t xml:space="preserve">.</w:t>
+            </w:r>
+          </w:p>
+        </w:tc>
+      </w:tr>
+      <w:tr>
+        <w:tc>
+          <w:tcPr>
+            <w:tcW w:w="2700" w:type="dxa"/>
             <w:shd w:val="clear" w:color="auto" w:fill="F5F5F5"/>
           </w:tcPr>
           <w:p>
             <w:r>
-              <w:t xml:space="preserve">Append </w:t>
-            </w:r>
-            <w:r>
-              <w:rPr>
-                <w:rFonts w:ascii="Courier New" w:hAnsi="Courier New"/>
-                <w:sz w:val="18"/>
-                <w:szCs w:val="18"/>
-                <w:shd w:val="clear" w:color="auto" w:fill="EBEBEB"/>
-              </w:rPr>
-              <w:t xml:space="preserve">.&lt;suffix&gt;</w:t>
-            </w:r>
-            <w:r>
-              <w:t xml:space="preserve"> to every UID field in each file. If the result would exceed 64 characters the last dot-delimited component is replaced instead of appended. </w:t>
-            </w:r>
-            <w:r>
-              <w:rPr>
-                <w:rFonts w:ascii="Courier New" w:hAnsi="Courier New"/>
-                <w:sz w:val="18"/>
-                <w:szCs w:val="18"/>
-                <w:shd w:val="clear" w:color="auto" w:fill="EBEBEB"/>
-              </w:rPr>
-              <w:t xml:space="preserve">&lt;suffix&gt;</w:t>
-            </w:r>
-            <w:r>
-              <w:t xml:space="preserve"> must contain digits only. Transfer Syntax UIDs are excluded. Mutually exclusive with </w:t>
-            </w:r>
-            <w:r>
               <w:rPr>
                 <w:rFonts w:ascii="Courier New" w:hAnsi="Courier New"/>
                 <w:sz w:val="18"/>
@@ -1656,6 +1762,26 @@
               </w:rPr>
               <w:t xml:space="preserve">remapuids:true</w:t>
             </w:r>
+          </w:p>
+        </w:tc>
+        <w:tc>
+          <w:tcPr>
+            <w:tcW w:w="6300" w:type="dxa"/>
+            <w:shd w:val="clear" w:color="auto" w:fill="F5F5F5"/>
+          </w:tcPr>
+          <w:p>
+            <w:r>
+              <w:t xml:space="preserve">Replace every study, series, and instance UID — and all references to them — with a freshly generated UID. Remapping is consistent across the entire run: the same source UID always maps to the same new UID in every file, so study/series/instance relationships and internal cross-references are preserved while linkage to the source is severed. SOP Class UIDs, Transfer Syntax UIDs, and the Implementation Class UID are left unchanged so files remain valid. Cannot be combined with </w:t>
+            </w:r>
+            <w:r>
+              <w:rPr>
+                <w:rFonts w:ascii="Courier New" w:hAnsi="Courier New"/>
+                <w:sz w:val="18"/>
+                <w:szCs w:val="18"/>
+                <w:shd w:val="clear" w:color="auto" w:fill="EBEBEB"/>
+              </w:rPr>
+              <w:t xml:space="preserve">uid:</w:t>
+            </w:r>
             <w:r>
               <w:t xml:space="preserve">.</w:t>
             </w:r>
@@ -1675,26 +1801,56 @@
                 <w:szCs w:val="18"/>
                 <w:shd w:val="clear" w:color="auto" w:fill="EBEBEB"/>
               </w:rPr>
-              <w:t xml:space="preserve">remapuids:true</w:t>
-            </w:r>
-          </w:p>
-        </w:tc>
-        <w:tc>
-          <w:tcPr>
-            <w:tcW w:w="6300" w:type="dxa"/>
-          </w:tcPr>
-          <w:p>
-            <w:r>
-              <w:t xml:space="preserve">Replace every study, series, and instance UID — and all references to them — with a freshly generated UID. Remapping is consistent across the entire run: the same source UID always maps to the same new UID in every file, so study/series/instance relationships and internal cross-references are preserved while linkage to the source is severed. SOP Class UIDs, Transfer Syntax UIDs, and the Implementation Class UID are left unchanged so files remain valid. Cannot be combined with </w:t>
-            </w:r>
-            <w:r>
-              <w:rPr>
-                <w:rFonts w:ascii="Courier New" w:hAnsi="Courier New"/>
-                <w:sz w:val="18"/>
-                <w:szCs w:val="18"/>
-                <w:shd w:val="clear" w:color="auto" w:fill="EBEBEB"/>
-              </w:rPr>
-              <w:t xml:space="preserve">uid:</w:t>
+              <w:t xml:space="preserve">noprivate:true</w:t>
+            </w:r>
+          </w:p>
+        </w:tc>
+        <w:tc>
+          <w:tcPr>
+            <w:tcW w:w="6300" w:type="dxa"/>
+          </w:tcPr>
+          <w:p>
+            <w:r>
+              <w:t xml:space="preserve">Remove all private tags (those with an odd group number) before writing output.</w:t>
+            </w:r>
+          </w:p>
+        </w:tc>
+      </w:tr>
+      <w:tr>
+        <w:tc>
+          <w:tcPr>
+            <w:tcW w:w="2700" w:type="dxa"/>
+            <w:shd w:val="clear" w:color="auto" w:fill="F5F5F5"/>
+          </w:tcPr>
+          <w:p>
+            <w:r>
+              <w:rPr>
+                <w:rFonts w:ascii="Courier New" w:hAnsi="Courier New"/>
+                <w:sz w:val="18"/>
+                <w:szCs w:val="18"/>
+                <w:shd w:val="clear" w:color="auto" w:fill="EBEBEB"/>
+              </w:rPr>
+              <w:t xml:space="preserve">ignoretype:&lt;types&gt;</w:t>
+            </w:r>
+          </w:p>
+        </w:tc>
+        <w:tc>
+          <w:tcPr>
+            <w:tcW w:w="6300" w:type="dxa"/>
+            <w:shd w:val="clear" w:color="auto" w:fill="F5F5F5"/>
+          </w:tcPr>
+          <w:p>
+            <w:r>
+              <w:t xml:space="preserve">Skip files whose Image Type tag (0008,0008) contains any of the supplied comma-delimited values. Comparison is case-insensitive. Example: </w:t>
+            </w:r>
+            <w:r>
+              <w:rPr>
+                <w:rFonts w:ascii="Courier New" w:hAnsi="Courier New"/>
+                <w:sz w:val="18"/>
+                <w:szCs w:val="18"/>
+                <w:shd w:val="clear" w:color="auto" w:fill="EBEBEB"/>
+              </w:rPr>
+              <w:t xml:space="preserve">ignoretype:SECONDARY,DERIVED</w:t>
             </w:r>
             <w:r>
               <w:t xml:space="preserve">.</w:t>
@@ -1706,6 +1862,46 @@
         <w:tc>
           <w:tcPr>
             <w:tcW w:w="2700" w:type="dxa"/>
+          </w:tcPr>
+          <w:p>
+            <w:r>
+              <w:rPr>
+                <w:rFonts w:ascii="Courier New" w:hAnsi="Courier New"/>
+                <w:sz w:val="18"/>
+                <w:szCs w:val="18"/>
+                <w:shd w:val="clear" w:color="auto" w:fill="EBEBEB"/>
+              </w:rPr>
+              <w:t xml:space="preserve">ignoremodality:&lt;modalities&gt;</w:t>
+            </w:r>
+          </w:p>
+        </w:tc>
+        <w:tc>
+          <w:tcPr>
+            <w:tcW w:w="6300" w:type="dxa"/>
+          </w:tcPr>
+          <w:p>
+            <w:r>
+              <w:t xml:space="preserve">Skip files whose Modality tag (0008,0060) matches any of the supplied comma-delimited values. Comparison is case-insensitive. Example: </w:t>
+            </w:r>
+            <w:r>
+              <w:rPr>
+                <w:rFonts w:ascii="Courier New" w:hAnsi="Courier New"/>
+                <w:sz w:val="18"/>
+                <w:szCs w:val="18"/>
+                <w:shd w:val="clear" w:color="auto" w:fill="EBEBEB"/>
+              </w:rPr>
+              <w:t xml:space="preserve">ignoremodality:SC,PR</w:t>
+            </w:r>
+            <w:r>
+              <w:t xml:space="preserve">.</w:t>
+            </w:r>
+          </w:p>
+        </w:tc>
+      </w:tr>
+      <w:tr>
+        <w:tc>
+          <w:tcPr>
+            <w:tcW w:w="2700" w:type="dxa"/>
             <w:shd w:val="clear" w:color="auto" w:fill="F5F5F5"/>
           </w:tcPr>
           <w:p>
@@ -1716,7 +1912,7 @@
                 <w:szCs w:val="18"/>
                 <w:shd w:val="clear" w:color="auto" w:fill="EBEBEB"/>
               </w:rPr>
-              <w:t xml:space="preserve">noprivate:true</w:t>
+              <w:t xml:space="preserve">maskrows:&lt;n&gt;</w:t>
             </w:r>
           </w:p>
         </w:tc>
@@ -1727,44 +1923,234 @@
           </w:tcPr>
           <w:p>
             <w:r>
-              <w:t xml:space="preserve">Remove all private tags (those with an odd group number) before writing output.</w:t>
-            </w:r>
-          </w:p>
-        </w:tc>
-      </w:tr>
-      <w:tr>
-        <w:tc>
-          <w:tcPr>
-            <w:tcW w:w="2700" w:type="dxa"/>
-          </w:tcPr>
-          <w:p>
-            <w:r>
-              <w:rPr>
-                <w:rFonts w:ascii="Courier New" w:hAnsi="Courier New"/>
-                <w:sz w:val="18"/>
-                <w:szCs w:val="18"/>
-                <w:shd w:val="clear" w:color="auto" w:fill="EBEBEB"/>
-              </w:rPr>
-              <w:t xml:space="preserve">ignoretype:&lt;types&gt;</w:t>
-            </w:r>
-          </w:p>
-        </w:tc>
-        <w:tc>
-          <w:tcPr>
-            <w:tcW w:w="6300" w:type="dxa"/>
-          </w:tcPr>
-          <w:p>
-            <w:r>
-              <w:t xml:space="preserve">Skip files whose Image Type tag (0008,0008) contains any of the supplied comma-delimited values. Comparison is case-insensitive. Example: </w:t>
-            </w:r>
-            <w:r>
-              <w:rPr>
-                <w:rFonts w:ascii="Courier New" w:hAnsi="Courier New"/>
-                <w:sz w:val="18"/>
-                <w:szCs w:val="18"/>
-                <w:shd w:val="clear" w:color="auto" w:fill="EBEBEB"/>
-              </w:rPr>
-              <w:t xml:space="preserve">ignoretype:SECONDARY,DERIVED</w:t>
+              <w:t xml:space="preserve">Zero out the first </w:t>
+            </w:r>
+            <w:r>
+              <w:rPr>
+                <w:rFonts w:ascii="Courier New" w:hAnsi="Courier New"/>
+                <w:sz w:val="18"/>
+                <w:szCs w:val="18"/>
+                <w:shd w:val="clear" w:color="auto" w:fill="EBEBEB"/>
+              </w:rPr>
+              <w:t xml:space="preserve">n</w:t>
+            </w:r>
+            <w:r>
+              <w:t xml:space="preserve"> pixel rows from the top of each image frame. Applies only to uncompressed (native) pixel data; compressed files produce a warning when </w:t>
+            </w:r>
+            <w:r>
+              <w:rPr>
+                <w:rFonts w:ascii="Courier New" w:hAnsi="Courier New"/>
+                <w:sz w:val="18"/>
+                <w:szCs w:val="18"/>
+                <w:shd w:val="clear" w:color="auto" w:fill="EBEBEB"/>
+              </w:rPr>
+              <w:t xml:space="preserve">verbose:true</w:t>
+            </w:r>
+            <w:r>
+              <w:t xml:space="preserve"> is set. </w:t>
+            </w:r>
+            <w:r>
+              <w:rPr>
+                <w:rFonts w:ascii="Courier New" w:hAnsi="Courier New"/>
+                <w:sz w:val="18"/>
+                <w:szCs w:val="18"/>
+                <w:shd w:val="clear" w:color="auto" w:fill="EBEBEB"/>
+              </w:rPr>
+              <w:t xml:space="preserve">n</w:t>
+            </w:r>
+            <w:r>
+              <w:t xml:space="preserve"> must be a positive integer.</w:t>
+            </w:r>
+          </w:p>
+        </w:tc>
+      </w:tr>
+      <w:tr>
+        <w:tc>
+          <w:tcPr>
+            <w:tcW w:w="2700" w:type="dxa"/>
+          </w:tcPr>
+          <w:p>
+            <w:r>
+              <w:rPr>
+                <w:rFonts w:ascii="Courier New" w:hAnsi="Courier New"/>
+                <w:sz w:val="18"/>
+                <w:szCs w:val="18"/>
+                <w:shd w:val="clear" w:color="auto" w:fill="EBEBEB"/>
+              </w:rPr>
+              <w:t xml:space="preserve">fixvr:correct|skip|passthrough</w:t>
+            </w:r>
+          </w:p>
+        </w:tc>
+        <w:tc>
+          <w:tcPr>
+            <w:tcW w:w="6300" w:type="dxa"/>
+          </w:tcPr>
+          <w:p>
+            <w:r>
+              <w:t xml:space="preserve">Handle tags whose Value Representation (VR) does not match the DICOM standard dictionary. </w:t>
+            </w:r>
+            <w:r>
+              <w:rPr>
+                <w:rFonts w:ascii="Courier New" w:hAnsi="Courier New"/>
+                <w:sz w:val="18"/>
+                <w:szCs w:val="18"/>
+                <w:shd w:val="clear" w:color="auto" w:fill="EBEBEB"/>
+              </w:rPr>
+              <w:t xml:space="preserve">correct</w:t>
+            </w:r>
+            <w:r>
+              <w:t xml:space="preserve"> attempts to re-encode the tag value under the correct VR, falling back to removal if the conversion is not possible. </w:t>
+            </w:r>
+            <w:r>
+              <w:rPr>
+                <w:rFonts w:ascii="Courier New" w:hAnsi="Courier New"/>
+                <w:sz w:val="18"/>
+                <w:szCs w:val="18"/>
+                <w:shd w:val="clear" w:color="auto" w:fill="EBEBEB"/>
+              </w:rPr>
+              <w:t xml:space="preserve">skip</w:t>
+            </w:r>
+            <w:r>
+              <w:t xml:space="preserve"> silently removes all mismatched tags. </w:t>
+            </w:r>
+            <w:r>
+              <w:rPr>
+                <w:rFonts w:ascii="Courier New" w:hAnsi="Courier New"/>
+                <w:sz w:val="18"/>
+                <w:szCs w:val="18"/>
+                <w:shd w:val="clear" w:color="auto" w:fill="EBEBEB"/>
+              </w:rPr>
+              <w:t xml:space="preserve">passthrough</w:t>
+            </w:r>
+            <w:r>
+              <w:t xml:space="preserve"> writes the file as-is, suppressing the VR verification error. Private and unknown tags are always kept unchanged. When </w:t>
+            </w:r>
+            <w:r>
+              <w:rPr>
+                <w:rFonts w:ascii="Courier New" w:hAnsi="Courier New"/>
+                <w:sz w:val="18"/>
+                <w:szCs w:val="18"/>
+                <w:shd w:val="clear" w:color="auto" w:fill="EBEBEB"/>
+              </w:rPr>
+              <w:t xml:space="preserve">verbose:true</w:t>
+            </w:r>
+            <w:r>
+              <w:t xml:space="preserve"> is set, each affected tag is reported.</w:t>
+            </w:r>
+          </w:p>
+        </w:tc>
+      </w:tr>
+      <w:tr>
+        <w:tc>
+          <w:tcPr>
+            <w:tcW w:w="2700" w:type="dxa"/>
+            <w:shd w:val="clear" w:color="auto" w:fill="F5F5F5"/>
+          </w:tcPr>
+          <w:p>
+            <w:r>
+              <w:rPr>
+                <w:rFonts w:ascii="Courier New" w:hAnsi="Courier New"/>
+                <w:sz w:val="18"/>
+                <w:szCs w:val="18"/>
+                <w:shd w:val="clear" w:color="auto" w:fill="EBEBEB"/>
+              </w:rPr>
+              <w:t xml:space="preserve">workers:&lt;n&gt;</w:t>
+            </w:r>
+          </w:p>
+        </w:tc>
+        <w:tc>
+          <w:tcPr>
+            <w:tcW w:w="6300" w:type="dxa"/>
+            <w:shd w:val="clear" w:color="auto" w:fill="F5F5F5"/>
+          </w:tcPr>
+          <w:p>
+            <w:r>
+              <w:t xml:space="preserve">Number of files to process simultaneously. Defaults to the number of logical CPU cores. Set to </w:t>
+            </w:r>
+            <w:r>
+              <w:rPr>
+                <w:rFonts w:ascii="Courier New" w:hAnsi="Courier New"/>
+                <w:sz w:val="18"/>
+                <w:szCs w:val="18"/>
+                <w:shd w:val="clear" w:color="auto" w:fill="EBEBEB"/>
+              </w:rPr>
+              <w:t xml:space="preserve">1</w:t>
+            </w:r>
+            <w:r>
+              <w:t xml:space="preserve"> to process files serially. Set to </w:t>
+            </w:r>
+            <w:r>
+              <w:rPr>
+                <w:rFonts w:ascii="Courier New" w:hAnsi="Courier New"/>
+                <w:sz w:val="18"/>
+                <w:szCs w:val="18"/>
+                <w:shd w:val="clear" w:color="auto" w:fill="EBEBEB"/>
+              </w:rPr>
+              <w:t xml:space="preserve">0</w:t>
+            </w:r>
+            <w:r>
+              <w:t xml:space="preserve"> to restore the default.</w:t>
+            </w:r>
+          </w:p>
+        </w:tc>
+      </w:tr>
+      <w:tr>
+        <w:tc>
+          <w:tcPr>
+            <w:tcW w:w="2700" w:type="dxa"/>
+          </w:tcPr>
+          <w:p>
+            <w:r>
+              <w:rPr>
+                <w:rFonts w:ascii="Courier New" w:hAnsi="Courier New"/>
+                <w:sz w:val="18"/>
+                <w:szCs w:val="18"/>
+                <w:shd w:val="clear" w:color="auto" w:fill="EBEBEB"/>
+              </w:rPr>
+              <w:t xml:space="preserve">zip:true</w:t>
+            </w:r>
+          </w:p>
+        </w:tc>
+        <w:tc>
+          <w:tcPr>
+            <w:tcW w:w="6300" w:type="dxa"/>
+          </w:tcPr>
+          <w:p>
+            <w:r>
+              <w:t xml:space="preserve">Package all output files into a single ZIP archive instead of writing them to a directory. The </w:t>
+            </w:r>
+            <w:r>
+              <w:rPr>
+                <w:rFonts w:ascii="Courier New" w:hAnsi="Courier New"/>
+                <w:sz w:val="18"/>
+                <w:szCs w:val="18"/>
+                <w:shd w:val="clear" w:color="auto" w:fill="EBEBEB"/>
+              </w:rPr>
+              <w:t xml:space="preserve">output:</w:t>
+            </w:r>
+            <w:r>
+              <w:t xml:space="preserve"> path is used as the ZIP file name; a </w:t>
+            </w:r>
+            <w:r>
+              <w:rPr>
+                <w:rFonts w:ascii="Courier New" w:hAnsi="Courier New"/>
+                <w:sz w:val="18"/>
+                <w:szCs w:val="18"/>
+                <w:shd w:val="clear" w:color="auto" w:fill="EBEBEB"/>
+              </w:rPr>
+              <w:t xml:space="preserve">.zip</w:t>
+            </w:r>
+            <w:r>
+              <w:t xml:space="preserve"> extension is appended automatically if not already present. Cannot be combined with </w:t>
+            </w:r>
+            <w:r>
+              <w:rPr>
+                <w:rFonts w:ascii="Courier New" w:hAnsi="Courier New"/>
+                <w:sz w:val="18"/>
+                <w:szCs w:val="18"/>
+                <w:shd w:val="clear" w:color="auto" w:fill="EBEBEB"/>
+              </w:rPr>
+              <w:t xml:space="preserve">dicomdir:true</w:t>
             </w:r>
             <w:r>
               <w:t xml:space="preserve">.</w:t>
@@ -1786,7 +2172,7 @@
                 <w:szCs w:val="18"/>
                 <w:shd w:val="clear" w:color="auto" w:fill="EBEBEB"/>
               </w:rPr>
-              <w:t xml:space="preserve">ignoremodality:&lt;modalities&gt;</w:t>
+              <w:t xml:space="preserve">dicomdir:true</w:t>
             </w:r>
           </w:p>
         </w:tc>
@@ -1797,16 +2183,16 @@
           </w:tcPr>
           <w:p>
             <w:r>
-              <w:t xml:space="preserve">Skip files whose Modality tag (0008,0060) matches any of the supplied comma-delimited values. Comparison is case-insensitive. Example: </w:t>
-            </w:r>
-            <w:r>
-              <w:rPr>
-                <w:rFonts w:ascii="Courier New" w:hAnsi="Courier New"/>
-                <w:sz w:val="18"/>
-                <w:szCs w:val="18"/>
-                <w:shd w:val="clear" w:color="auto" w:fill="EBEBEB"/>
-              </w:rPr>
-              <w:t xml:space="preserve">ignoremodality:SC,PR</w:t>
+              <w:t xml:space="preserve">After all files have been written, generate a DICOMDIR index file in the output directory. Cannot be combined with </w:t>
+            </w:r>
+            <w:r>
+              <w:rPr>
+                <w:rFonts w:ascii="Courier New" w:hAnsi="Courier New"/>
+                <w:sz w:val="18"/>
+                <w:szCs w:val="18"/>
+                <w:shd w:val="clear" w:color="auto" w:fill="EBEBEB"/>
+              </w:rPr>
+              <w:t xml:space="preserve">zip:true</w:t>
             </w:r>
             <w:r>
               <w:t xml:space="preserve">.</w:t>
@@ -1827,30 +2213,81 @@
                 <w:szCs w:val="18"/>
                 <w:shd w:val="clear" w:color="auto" w:fill="EBEBEB"/>
               </w:rPr>
-              <w:t xml:space="preserve">maskrows:&lt;n&gt;</w:t>
-            </w:r>
-          </w:p>
-        </w:tc>
-        <w:tc>
-          <w:tcPr>
-            <w:tcW w:w="6300" w:type="dxa"/>
-          </w:tcPr>
-          <w:p>
-            <w:r>
-              <w:t xml:space="preserve">Zero out the first </w:t>
-            </w:r>
-            <w:r>
-              <w:rPr>
-                <w:rFonts w:ascii="Courier New" w:hAnsi="Courier New"/>
-                <w:sz w:val="18"/>
-                <w:szCs w:val="18"/>
-                <w:shd w:val="clear" w:color="auto" w:fill="EBEBEB"/>
-              </w:rPr>
-              <w:t xml:space="preserve">n</w:t>
-            </w:r>
-            <w:r>
-              <w:t xml:space="preserve"> pixel rows from the top of each image frame. Applies only to uncompressed (native) pixel data; compressed files produce a warning when </w:t>
-            </w:r>
+              <w:t xml:space="preserve">profile:&lt;name&gt;</w:t>
+            </w:r>
+          </w:p>
+        </w:tc>
+        <w:tc>
+          <w:tcPr>
+            <w:tcW w:w="6300" w:type="dxa"/>
+          </w:tcPr>
+          <w:p>
+            <w:r>
+              <w:t xml:space="preserve">Apply a named processing profile from </w:t>
+            </w:r>
+            <w:r>
+              <w:rPr>
+                <w:rFonts w:ascii="Courier New" w:hAnsi="Courier New"/>
+                <w:sz w:val="18"/>
+                <w:szCs w:val="18"/>
+                <w:shd w:val="clear" w:color="auto" w:fill="EBEBEB"/>
+              </w:rPr>
+              <w:t xml:space="preserve">profiles.json</w:t>
+            </w:r>
+            <w:r>
+              <w:t xml:space="preserve">. CLI parameters take precedence over profile values. See Section 6.</w:t>
+            </w:r>
+          </w:p>
+        </w:tc>
+      </w:tr>
+      <w:tr>
+        <w:tc>
+          <w:tcPr>
+            <w:tcW w:w="2700" w:type="dxa"/>
+            <w:shd w:val="clear" w:color="auto" w:fill="F5F5F5"/>
+          </w:tcPr>
+          <w:p>
+            <w:r>
+              <w:rPr>
+                <w:rFonts w:ascii="Courier New" w:hAnsi="Courier New"/>
+                <w:sz w:val="18"/>
+                <w:szCs w:val="18"/>
+                <w:shd w:val="clear" w:color="auto" w:fill="EBEBEB"/>
+              </w:rPr>
+              <w:t xml:space="preserve">errorlog:txt|csv|json</w:t>
+            </w:r>
+          </w:p>
+        </w:tc>
+        <w:tc>
+          <w:tcPr>
+            <w:tcW w:w="6300" w:type="dxa"/>
+            <w:shd w:val="clear" w:color="auto" w:fill="F5F5F5"/>
+          </w:tcPr>
+          <w:p>
+            <w:r>
+              <w:t xml:space="preserve">When one or more files fail, write the detailed per-file error messages to an </w:t>
+            </w:r>
+            <w:r>
+              <w:rPr>
+                <w:rFonts w:ascii="Courier New" w:hAnsi="Courier New"/>
+                <w:sz w:val="18"/>
+                <w:szCs w:val="18"/>
+                <w:shd w:val="clear" w:color="auto" w:fill="EBEBEB"/>
+              </w:rPr>
+              <w:t xml:space="preserve">ERROR.&lt;ext&gt;</w:t>
+            </w:r>
+            <w:r>
+              <w:t xml:space="preserve"> file in the root of the output directory instead of the console, in the chosen format. Without this parameter, the details print to the console. See the Error Handling subsection.</w:t>
+            </w:r>
+          </w:p>
+        </w:tc>
+      </w:tr>
+      <w:tr>
+        <w:tc>
+          <w:tcPr>
+            <w:tcW w:w="2700" w:type="dxa"/>
+          </w:tcPr>
+          <w:p>
             <w:r>
               <w:rPr>
                 <w:rFonts w:ascii="Courier New" w:hAnsi="Courier New"/>
@@ -1860,364 +2297,11 @@
               </w:rPr>
               <w:t xml:space="preserve">verbose:true</w:t>
             </w:r>
-            <w:r>
-              <w:t xml:space="preserve"> is set. </w:t>
-            </w:r>
-            <w:r>
-              <w:rPr>
-                <w:rFonts w:ascii="Courier New" w:hAnsi="Courier New"/>
-                <w:sz w:val="18"/>
-                <w:szCs w:val="18"/>
-                <w:shd w:val="clear" w:color="auto" w:fill="EBEBEB"/>
-              </w:rPr>
-              <w:t xml:space="preserve">n</w:t>
-            </w:r>
-            <w:r>
-              <w:t xml:space="preserve"> must be a positive integer.</w:t>
-            </w:r>
-          </w:p>
-        </w:tc>
-      </w:tr>
-      <w:tr>
-        <w:tc>
-          <w:tcPr>
-            <w:tcW w:w="2700" w:type="dxa"/>
-            <w:shd w:val="clear" w:color="auto" w:fill="F5F5F5"/>
-          </w:tcPr>
-          <w:p>
-            <w:r>
-              <w:rPr>
-                <w:rFonts w:ascii="Courier New" w:hAnsi="Courier New"/>
-                <w:sz w:val="18"/>
-                <w:szCs w:val="18"/>
-                <w:shd w:val="clear" w:color="auto" w:fill="EBEBEB"/>
-              </w:rPr>
-              <w:t xml:space="preserve">fixvr:correct|skip|passthrough</w:t>
-            </w:r>
-          </w:p>
-        </w:tc>
-        <w:tc>
-          <w:tcPr>
-            <w:tcW w:w="6300" w:type="dxa"/>
-            <w:shd w:val="clear" w:color="auto" w:fill="F5F5F5"/>
-          </w:tcPr>
-          <w:p>
-            <w:r>
-              <w:t xml:space="preserve">Handle tags whose Value Representation (VR) does not match the DICOM standard dictionary. </w:t>
-            </w:r>
-            <w:r>
-              <w:rPr>
-                <w:rFonts w:ascii="Courier New" w:hAnsi="Courier New"/>
-                <w:sz w:val="18"/>
-                <w:szCs w:val="18"/>
-                <w:shd w:val="clear" w:color="auto" w:fill="EBEBEB"/>
-              </w:rPr>
-              <w:t xml:space="preserve">correct</w:t>
-            </w:r>
-            <w:r>
-              <w:t xml:space="preserve"> attempts to re-encode the tag value under the correct VR, falling back to removal if the conversion is not possible. </w:t>
-            </w:r>
-            <w:r>
-              <w:rPr>
-                <w:rFonts w:ascii="Courier New" w:hAnsi="Courier New"/>
-                <w:sz w:val="18"/>
-                <w:szCs w:val="18"/>
-                <w:shd w:val="clear" w:color="auto" w:fill="EBEBEB"/>
-              </w:rPr>
-              <w:t xml:space="preserve">skip</w:t>
-            </w:r>
-            <w:r>
-              <w:t xml:space="preserve"> silently removes all mismatched tags. </w:t>
-            </w:r>
-            <w:r>
-              <w:rPr>
-                <w:rFonts w:ascii="Courier New" w:hAnsi="Courier New"/>
-                <w:sz w:val="18"/>
-                <w:szCs w:val="18"/>
-                <w:shd w:val="clear" w:color="auto" w:fill="EBEBEB"/>
-              </w:rPr>
-              <w:t xml:space="preserve">passthrough</w:t>
-            </w:r>
-            <w:r>
-              <w:t xml:space="preserve"> writes the file as-is, suppressing the VR verification error. Private and unknown tags are always kept unchanged. When </w:t>
-            </w:r>
-            <w:r>
-              <w:rPr>
-                <w:rFonts w:ascii="Courier New" w:hAnsi="Courier New"/>
-                <w:sz w:val="18"/>
-                <w:szCs w:val="18"/>
-                <w:shd w:val="clear" w:color="auto" w:fill="EBEBEB"/>
-              </w:rPr>
-              <w:t xml:space="preserve">verbose:true</w:t>
-            </w:r>
-            <w:r>
-              <w:t xml:space="preserve"> is set, each affected tag is reported.</w:t>
-            </w:r>
-          </w:p>
-        </w:tc>
-      </w:tr>
-      <w:tr>
-        <w:tc>
-          <w:tcPr>
-            <w:tcW w:w="2700" w:type="dxa"/>
-          </w:tcPr>
-          <w:p>
-            <w:r>
-              <w:rPr>
-                <w:rFonts w:ascii="Courier New" w:hAnsi="Courier New"/>
-                <w:sz w:val="18"/>
-                <w:szCs w:val="18"/>
-                <w:shd w:val="clear" w:color="auto" w:fill="EBEBEB"/>
-              </w:rPr>
-              <w:t xml:space="preserve">workers:&lt;n&gt;</w:t>
-            </w:r>
-          </w:p>
-        </w:tc>
-        <w:tc>
-          <w:tcPr>
-            <w:tcW w:w="6300" w:type="dxa"/>
-          </w:tcPr>
-          <w:p>
-            <w:r>
-              <w:t xml:space="preserve">Number of files to process simultaneously. Defaults to the number of logical CPU cores. Set to </w:t>
-            </w:r>
-            <w:r>
-              <w:rPr>
-                <w:rFonts w:ascii="Courier New" w:hAnsi="Courier New"/>
-                <w:sz w:val="18"/>
-                <w:szCs w:val="18"/>
-                <w:shd w:val="clear" w:color="auto" w:fill="EBEBEB"/>
-              </w:rPr>
-              <w:t xml:space="preserve">1</w:t>
-            </w:r>
-            <w:r>
-              <w:t xml:space="preserve"> to process files serially. Set to </w:t>
-            </w:r>
-            <w:r>
-              <w:rPr>
-                <w:rFonts w:ascii="Courier New" w:hAnsi="Courier New"/>
-                <w:sz w:val="18"/>
-                <w:szCs w:val="18"/>
-                <w:shd w:val="clear" w:color="auto" w:fill="EBEBEB"/>
-              </w:rPr>
-              <w:t xml:space="preserve">0</w:t>
-            </w:r>
-            <w:r>
-              <w:t xml:space="preserve"> to restore the default.</w:t>
-            </w:r>
-          </w:p>
-        </w:tc>
-      </w:tr>
-      <w:tr>
-        <w:tc>
-          <w:tcPr>
-            <w:tcW w:w="2700" w:type="dxa"/>
-            <w:shd w:val="clear" w:color="auto" w:fill="F5F5F5"/>
-          </w:tcPr>
-          <w:p>
-            <w:r>
-              <w:rPr>
-                <w:rFonts w:ascii="Courier New" w:hAnsi="Courier New"/>
-                <w:sz w:val="18"/>
-                <w:szCs w:val="18"/>
-                <w:shd w:val="clear" w:color="auto" w:fill="EBEBEB"/>
-              </w:rPr>
-              <w:t xml:space="preserve">zip:true</w:t>
-            </w:r>
-          </w:p>
-        </w:tc>
-        <w:tc>
-          <w:tcPr>
-            <w:tcW w:w="6300" w:type="dxa"/>
-            <w:shd w:val="clear" w:color="auto" w:fill="F5F5F5"/>
-          </w:tcPr>
-          <w:p>
-            <w:r>
-              <w:t xml:space="preserve">Package all output files into a single ZIP archive instead of writing them to a directory. The </w:t>
-            </w:r>
-            <w:r>
-              <w:rPr>
-                <w:rFonts w:ascii="Courier New" w:hAnsi="Courier New"/>
-                <w:sz w:val="18"/>
-                <w:szCs w:val="18"/>
-                <w:shd w:val="clear" w:color="auto" w:fill="EBEBEB"/>
-              </w:rPr>
-              <w:t xml:space="preserve">output:</w:t>
-            </w:r>
-            <w:r>
-              <w:t xml:space="preserve"> path is used as the ZIP file name; a </w:t>
-            </w:r>
-            <w:r>
-              <w:rPr>
-                <w:rFonts w:ascii="Courier New" w:hAnsi="Courier New"/>
-                <w:sz w:val="18"/>
-                <w:szCs w:val="18"/>
-                <w:shd w:val="clear" w:color="auto" w:fill="EBEBEB"/>
-              </w:rPr>
-              <w:t xml:space="preserve">.zip</w:t>
-            </w:r>
-            <w:r>
-              <w:t xml:space="preserve"> extension is appended automatically if not already present. Cannot be combined with </w:t>
-            </w:r>
-            <w:r>
-              <w:rPr>
-                <w:rFonts w:ascii="Courier New" w:hAnsi="Courier New"/>
-                <w:sz w:val="18"/>
-                <w:szCs w:val="18"/>
-                <w:shd w:val="clear" w:color="auto" w:fill="EBEBEB"/>
-              </w:rPr>
-              <w:t xml:space="preserve">dicomdir:true</w:t>
-            </w:r>
-            <w:r>
-              <w:t xml:space="preserve">.</w:t>
-            </w:r>
-          </w:p>
-        </w:tc>
-      </w:tr>
-      <w:tr>
-        <w:tc>
-          <w:tcPr>
-            <w:tcW w:w="2700" w:type="dxa"/>
-          </w:tcPr>
-          <w:p>
-            <w:r>
-              <w:rPr>
-                <w:rFonts w:ascii="Courier New" w:hAnsi="Courier New"/>
-                <w:sz w:val="18"/>
-                <w:szCs w:val="18"/>
-                <w:shd w:val="clear" w:color="auto" w:fill="EBEBEB"/>
-              </w:rPr>
-              <w:t xml:space="preserve">dicomdir:true</w:t>
-            </w:r>
-          </w:p>
-        </w:tc>
-        <w:tc>
-          <w:tcPr>
-            <w:tcW w:w="6300" w:type="dxa"/>
-          </w:tcPr>
-          <w:p>
-            <w:r>
-              <w:t xml:space="preserve">After all files have been written, generate a DICOMDIR index file in the output directory. Cannot be combined with </w:t>
-            </w:r>
-            <w:r>
-              <w:rPr>
-                <w:rFonts w:ascii="Courier New" w:hAnsi="Courier New"/>
-                <w:sz w:val="18"/>
-                <w:szCs w:val="18"/>
-                <w:shd w:val="clear" w:color="auto" w:fill="EBEBEB"/>
-              </w:rPr>
-              <w:t xml:space="preserve">zip:true</w:t>
-            </w:r>
-            <w:r>
-              <w:t xml:space="preserve">.</w:t>
-            </w:r>
-          </w:p>
-        </w:tc>
-      </w:tr>
-      <w:tr>
-        <w:tc>
-          <w:tcPr>
-            <w:tcW w:w="2700" w:type="dxa"/>
-            <w:shd w:val="clear" w:color="auto" w:fill="F5F5F5"/>
-          </w:tcPr>
-          <w:p>
-            <w:r>
-              <w:rPr>
-                <w:rFonts w:ascii="Courier New" w:hAnsi="Courier New"/>
-                <w:sz w:val="18"/>
-                <w:szCs w:val="18"/>
-                <w:shd w:val="clear" w:color="auto" w:fill="EBEBEB"/>
-              </w:rPr>
-              <w:t xml:space="preserve">profile:&lt;name&gt;</w:t>
-            </w:r>
-          </w:p>
-        </w:tc>
-        <w:tc>
-          <w:tcPr>
-            <w:tcW w:w="6300" w:type="dxa"/>
-            <w:shd w:val="clear" w:color="auto" w:fill="F5F5F5"/>
-          </w:tcPr>
-          <w:p>
-            <w:r>
-              <w:t xml:space="preserve">Apply a named processing profile from </w:t>
-            </w:r>
-            <w:r>
-              <w:rPr>
-                <w:rFonts w:ascii="Courier New" w:hAnsi="Courier New"/>
-                <w:sz w:val="18"/>
-                <w:szCs w:val="18"/>
-                <w:shd w:val="clear" w:color="auto" w:fill="EBEBEB"/>
-              </w:rPr>
-              <w:t xml:space="preserve">profiles.json</w:t>
-            </w:r>
-            <w:r>
-              <w:t xml:space="preserve">. CLI parameters take precedence over profile values. See Section 6.</w:t>
-            </w:r>
-          </w:p>
-        </w:tc>
-      </w:tr>
-      <w:tr>
-        <w:tc>
-          <w:tcPr>
-            <w:tcW w:w="2700" w:type="dxa"/>
-          </w:tcPr>
-          <w:p>
-            <w:r>
-              <w:rPr>
-                <w:rFonts w:ascii="Courier New" w:hAnsi="Courier New"/>
-                <w:sz w:val="18"/>
-                <w:szCs w:val="18"/>
-                <w:shd w:val="clear" w:color="auto" w:fill="EBEBEB"/>
-              </w:rPr>
-              <w:t xml:space="preserve">errorlog:txt|csv|json</w:t>
-            </w:r>
-          </w:p>
-        </w:tc>
-        <w:tc>
-          <w:tcPr>
-            <w:tcW w:w="6300" w:type="dxa"/>
-          </w:tcPr>
-          <w:p>
-            <w:r>
-              <w:t xml:space="preserve">When one or more files fail, write the detailed per-file error messages to an </w:t>
-            </w:r>
-            <w:r>
-              <w:rPr>
-                <w:rFonts w:ascii="Courier New" w:hAnsi="Courier New"/>
-                <w:sz w:val="18"/>
-                <w:szCs w:val="18"/>
-                <w:shd w:val="clear" w:color="auto" w:fill="EBEBEB"/>
-              </w:rPr>
-              <w:t xml:space="preserve">ERROR.&lt;ext&gt;</w:t>
-            </w:r>
-            <w:r>
-              <w:t xml:space="preserve"> file in the root of the output directory instead of the console, in the chosen format. Without this parameter, the details print to the console. See the Error Handling subsection.</w:t>
-            </w:r>
-          </w:p>
-        </w:tc>
-      </w:tr>
-      <w:tr>
-        <w:tc>
-          <w:tcPr>
-            <w:tcW w:w="2700" w:type="dxa"/>
-            <w:shd w:val="clear" w:color="auto" w:fill="F5F5F5"/>
-          </w:tcPr>
-          <w:p>
-            <w:r>
-              <w:rPr>
-                <w:rFonts w:ascii="Courier New" w:hAnsi="Courier New"/>
-                <w:sz w:val="18"/>
-                <w:szCs w:val="18"/>
-                <w:shd w:val="clear" w:color="auto" w:fill="EBEBEB"/>
-              </w:rPr>
-              <w:t xml:space="preserve">verbose:true</w:t>
-            </w:r>
-          </w:p>
-        </w:tc>
-        <w:tc>
-          <w:tcPr>
-            <w:tcW w:w="6300" w:type="dxa"/>
-            <w:shd w:val="clear" w:color="auto" w:fill="F5F5F5"/>
+          </w:p>
+        </w:tc>
+        <w:tc>
+          <w:tcPr>
+            <w:tcW w:w="6300" w:type="dxa"/>
           </w:tcPr>
           <w:p>
             <w:r>
@@ -2354,7 +2438,27 @@
         <w:pStyle w:val="ListBullet"/>
       </w:pPr>
       <w:r>
-        <w:t xml:space="preserve">7. Apply DOB mask (if </w:t>
+        <w:t xml:space="preserve">7. Shift DA/DT date fields (if </w:t>
+      </w:r>
+      <w:r>
+        <w:rPr>
+          <w:rFonts w:ascii="Courier New" w:hAnsi="Courier New"/>
+          <w:sz w:val="18"/>
+          <w:szCs w:val="18"/>
+          <w:shd w:val="clear" w:color="auto" w:fill="EBEBEB"/>
+        </w:rPr>
+        <w:t xml:space="preserve">shiftdays:</w:t>
+      </w:r>
+      <w:r>
+        <w:t xml:space="preserve"> supplied)</w:t>
+      </w:r>
+    </w:p>
+    <w:p>
+      <w:pPr>
+        <w:pStyle w:val="ListBullet"/>
+      </w:pPr>
+      <w:r>
+        <w:t xml:space="preserve">8. Apply DOB mask (if </w:t>
       </w:r>
       <w:r>
         <w:rPr>
@@ -2374,7 +2478,7 @@
         <w:pStyle w:val="ListBullet"/>
       </w:pPr>
       <w:r>
-        <w:t xml:space="preserve">8. Apply UID suffix (if </w:t>
+        <w:t xml:space="preserve">9. Apply UID suffix (if </w:t>
       </w:r>
       <w:r>
         <w:rPr>
@@ -2406,7 +2510,7 @@
         <w:pStyle w:val="ListBullet"/>
       </w:pPr>
       <w:r>
-        <w:t xml:space="preserve">9. Apply row mask (if </w:t>
+        <w:t xml:space="preserve">10. Apply row mask (if </w:t>
       </w:r>
       <w:r>
         <w:rPr>
@@ -2426,7 +2530,7 @@
         <w:pStyle w:val="ListBullet"/>
       </w:pPr>
       <w:r>
-        <w:t xml:space="preserve">10. Apply all </w:t>
+        <w:t xml:space="preserve">11. Apply all </w:t>
       </w:r>
       <w:r>
         <w:rPr>
@@ -2446,7 +2550,7 @@
         <w:pStyle w:val="ListBullet"/>
       </w:pPr>
       <w:r>
-        <w:t xml:space="preserve">11. Write output file to directory, or to the ZIP archive if </w:t>
+        <w:t xml:space="preserve">12. Write output file to directory, or to the ZIP archive if </w:t>
       </w:r>
       <w:r>
         <w:rPr>
@@ -2839,6 +2943,22 @@
       </w:pPr>
       <w:r>
         <w:t xml:space="preserve">    profile:base-deident errorlog:json</w:t>
+      </w:r>
+    </w:p>
+    <w:p>
+      <w:pPr>
+        <w:pStyle w:val="Code"/>
+      </w:pPr>
+      <w:r>
+        <w:t xml:space="preserve">dicomtool modify input:C:\study output:C:\deidentified</w:t>
+      </w:r>
+    </w:p>
+    <w:p>
+      <w:pPr>
+        <w:pStyle w:val="Code"/>
+      </w:pPr>
+      <w:r>
+        <w:t xml:space="preserve">    shiftdays:-45 noprivate:true</w:t>
       </w:r>
     </w:p>
     <w:p>
@@ -7025,7 +7145,131 @@
         <w:pStyle w:val="Heading2"/>
       </w:pPr>
       <w:r>
-        <w:t>8.7  Appending a UID Suffix</w:t>
+        <w:t>8.7  Shifting Date Fields</w:t>
+      </w:r>
+    </w:p>
+    <w:p>
+      <w:r>
+        <w:t xml:space="preserve">The </w:t>
+      </w:r>
+      <w:r>
+        <w:rPr>
+          <w:rFonts w:ascii="Courier New" w:hAnsi="Courier New"/>
+          <w:sz w:val="18"/>
+          <w:szCs w:val="18"/>
+          <w:shd w:val="clear" w:color="auto" w:fill="EBEBEB"/>
+        </w:rPr>
+        <w:t xml:space="preserve">shiftdays:&lt;n&gt;</w:t>
+      </w:r>
+      <w:r>
+        <w:t xml:space="preserve"> parameter shifts every DA (Date) and DT (DateTime) field by </w:t>
+      </w:r>
+      <w:r>
+        <w:rPr>
+          <w:rFonts w:ascii="Courier New" w:hAnsi="Courier New"/>
+          <w:sz w:val="18"/>
+          <w:szCs w:val="18"/>
+          <w:shd w:val="clear" w:color="auto" w:fill="EBEBEB"/>
+        </w:rPr>
+        <w:t xml:space="preserve">n</w:t>
+      </w:r>
+      <w:r>
+        <w:t xml:space="preserve"> days, preserving the interval between dates within a study (e.g. days between a baseline and follow-up exam) without exposing the real calendar dates. </w:t>
+      </w:r>
+      <w:r>
+        <w:rPr>
+          <w:rFonts w:ascii="Courier New" w:hAnsi="Courier New"/>
+          <w:sz w:val="18"/>
+          <w:szCs w:val="18"/>
+          <w:shd w:val="clear" w:color="auto" w:fill="EBEBEB"/>
+        </w:rPr>
+        <w:t xml:space="preserve">n</w:t>
+      </w:r>
+      <w:r>
+        <w:t xml:space="preserve"> may be negative, zero, or positive. Patient Date of Birth (0010,0030) is never touched by </w:t>
+      </w:r>
+      <w:r>
+        <w:rPr>
+          <w:rFonts w:ascii="Courier New" w:hAnsi="Courier New"/>
+          <w:sz w:val="18"/>
+          <w:szCs w:val="18"/>
+          <w:shd w:val="clear" w:color="auto" w:fill="EBEBEB"/>
+        </w:rPr>
+        <w:t xml:space="preserve">shiftdays:</w:t>
+      </w:r>
+      <w:r>
+        <w:t xml:space="preserve"> -- combine it with </w:t>
+      </w:r>
+      <w:r>
+        <w:rPr>
+          <w:rFonts w:ascii="Courier New" w:hAnsi="Courier New"/>
+          <w:sz w:val="18"/>
+          <w:szCs w:val="18"/>
+          <w:shd w:val="clear" w:color="auto" w:fill="EBEBEB"/>
+        </w:rPr>
+        <w:t xml:space="preserve">dob:</w:t>
+      </w:r>
+      <w:r>
+        <w:t xml:space="preserve"> if the birth date also needs to be masked.</w:t>
+      </w:r>
+    </w:p>
+    <w:p>
+      <w:r>
+        <w:t xml:space="preserve">Shift every date back by 45 days:</w:t>
+      </w:r>
+    </w:p>
+    <w:p>
+      <w:pPr>
+        <w:pStyle w:val="Code"/>
+      </w:pPr>
+      <w:r>
+        <w:t xml:space="preserve">dicomtool modify input:C:\study output:C:\out shiftdays:-45</w:t>
+      </w:r>
+    </w:p>
+    <w:p>
+      <w:r>
+        <w:t xml:space="preserve">Combine with other de-identification steps:</w:t>
+      </w:r>
+    </w:p>
+    <w:p>
+      <w:pPr>
+        <w:pStyle w:val="Code"/>
+      </w:pPr>
+      <w:r>
+        <w:t xml:space="preserve">dicomtool modify input:C:\study output:C:\out</w:t>
+      </w:r>
+    </w:p>
+    <w:p>
+      <w:pPr>
+        <w:pStyle w:val="Code"/>
+      </w:pPr>
+      <w:r>
+        <w:t xml:space="preserve">    set:PatientName=ANON dob:YYYY0101 noprivate:true shiftdays:-45</w:t>
+      </w:r>
+    </w:p>
+    <w:p>
+      <w:r>
+        <w:t xml:space="preserve">For a DT field such as AcquisitionDateTime (0008,002A), only the leading </w:t>
+      </w:r>
+      <w:r>
+        <w:rPr>
+          <w:rFonts w:ascii="Courier New" w:hAnsi="Courier New"/>
+          <w:sz w:val="18"/>
+          <w:szCs w:val="18"/>
+          <w:shd w:val="clear" w:color="auto" w:fill="EBEBEB"/>
+        </w:rPr>
+        <w:t xml:space="preserve">YYYYMMDD</w:t>
+      </w:r>
+      <w:r>
+        <w:t xml:space="preserve"> date component is shifted; the time, fraction, and timezone portion is left exactly as it was.</w:t>
+      </w:r>
+    </w:p>
+    <w:p>
+      <w:pPr>
+        <w:pStyle w:val="Heading2"/>
+      </w:pPr>
+      <w:r>
+        <w:t>8.8  Appending a UID Suffix</w:t>
       </w:r>
     </w:p>
     <w:p>
@@ -7063,7 +7307,7 @@
         <w:pStyle w:val="Heading2"/>
       </w:pPr>
       <w:r>
-        <w:t>8.8  Skipping Files by Image Type or Modality</w:t>
+        <w:t>8.9  Skipping Files by Image Type or Modality</w:t>
       </w:r>
     </w:p>
     <w:p>
@@ -7159,7 +7403,7 @@
         <w:pStyle w:val="Heading2"/>
       </w:pPr>
       <w:r>
-        <w:t>8.9  Masking Pixel Rows</w:t>
+        <w:t>8.10  Masking Pixel Rows</w:t>
       </w:r>
     </w:p>
     <w:p>
@@ -7300,7 +7544,7 @@
         <w:pStyle w:val="Heading2"/>
       </w:pPr>
       <w:r>
-        <w:t>8.10  Full De-identification Without a Profile</w:t>
+        <w:t>8.11  Full De-identification Without a Profile</w:t>
       </w:r>
     </w:p>
     <w:p>
@@ -7420,7 +7664,7 @@
         <w:pStyle w:val="Heading2"/>
       </w:pPr>
       <w:r>
-        <w:t>8.11  Applying a Profile</w:t>
+        <w:t>8.12  Applying a Profile</w:t>
       </w:r>
     </w:p>
     <w:p>
@@ -7436,7 +7680,7 @@
         <w:pStyle w:val="Heading2"/>
       </w:pPr>
       <w:r>
-        <w:t>8.12  Overriding a Profile Parameter</w:t>
+        <w:t>8.13  Overriding a Profile Parameter</w:t>
       </w:r>
     </w:p>
     <w:p>
@@ -7481,7 +7725,7 @@
         <w:pStyle w:val="Heading2"/>
       </w:pPr>
       <w:r>
-        <w:t>8.13  Generating a DICOMDIR</w:t>
+        <w:t>8.14  Generating a DICOMDIR</w:t>
       </w:r>
     </w:p>
     <w:p>
@@ -7519,7 +7763,7 @@
         <w:pStyle w:val="Heading2"/>
       </w:pPr>
       <w:r>
-        <w:t>8.14  Relative Output Path</w:t>
+        <w:t>8.15  Relative Output Path</w:t>
       </w:r>
     </w:p>
     <w:p>
@@ -7584,7 +7828,7 @@
         <w:pStyle w:val="Heading2"/>
       </w:pPr>
       <w:r>
-        <w:t>8.15  Managing Tag Aliases</w:t>
+        <w:t>8.16  Managing Tag Aliases</w:t>
       </w:r>
     </w:p>
     <w:p>
@@ -7658,7 +7902,7 @@
         <w:pStyle w:val="Heading2"/>
       </w:pPr>
       <w:r>
-        <w:t>8.16  Creating and Using a Profile</w:t>
+        <w:t>8.17  Creating and Using a Profile</w:t>
       </w:r>
     </w:p>
     <w:p>
@@ -7814,7 +8058,7 @@
         <w:pStyle w:val="Heading2"/>
       </w:pPr>
       <w:r>
-        <w:t>8.17  Using Profile Inheritance</w:t>
+        <w:t>8.18  Using Profile Inheritance</w:t>
       </w:r>
     </w:p>
     <w:p>
@@ -7941,7 +8185,7 @@
         <w:pStyle w:val="Heading2"/>
       </w:pPr>
       <w:r>
-        <w:t>8.18  Packaging Output as a ZIP Archive</w:t>
+        <w:t>8.19  Packaging Output as a ZIP Archive</w:t>
       </w:r>
     </w:p>
     <w:p>
@@ -8134,7 +8378,7 @@
         <w:pStyle w:val="Heading2"/>
       </w:pPr>
       <w:r>
-        <w:t>8.19  Handling Tags with Incorrect Value Representations</w:t>
+        <w:t>8.20  Handling Tags with Incorrect Value Representations</w:t>
       </w:r>
     </w:p>
     <w:p>
@@ -8475,7 +8719,7 @@
         <w:pStyle w:val="Heading2"/>
       </w:pPr>
       <w:r>
-        <w:t>8.20  Parallel Processing</w:t>
+        <w:t>8.21  Parallel Processing</w:t>
       </w:r>
     </w:p>
     <w:p>
@@ -8615,7 +8859,7 @@
         <w:pStyle w:val="Heading2"/>
       </w:pPr>
       <w:r>
-        <w:t>8.22  Resetting Configuration to Defaults</w:t>
+        <w:t>8.23  Resetting Configuration to Defaults</w:t>
       </w:r>
     </w:p>
     <w:p>
@@ -8681,7 +8925,7 @@
         <w:pStyle w:val="Heading2"/>
       </w:pPr>
       <w:r>
-        <w:t>8.23  Verbose Mode</w:t>
+        <w:t>8.24  Verbose Mode</w:t>
       </w:r>
     </w:p>
     <w:p>

</xml_diff>